<commit_message>
TS 1.1 and 1.4 Padam tamil
</commit_message>
<xml_diff>
--- a/TS-Padam/TS-1.1/TS 1.1 Tamil Pada Paatam Corrections.docx
+++ b/TS-Padam/TS-1.1/TS 1.1 Tamil Pada Paatam Corrections.docx
@@ -59,9 +59,8 @@
           <w:szCs w:val="32"/>
           <w:u w:val="single"/>
         </w:rPr>
-        <w:t xml:space="preserve">Observed </w:t>
+        <w:t xml:space="preserve">Observed till </w:t>
       </w:r>
-      <w:proofErr w:type="gramStart"/>
       <w:r>
         <w:rPr>
           <w:b/>
@@ -70,7 +69,7 @@
           <w:szCs w:val="32"/>
           <w:u w:val="single"/>
         </w:rPr>
-        <w:t xml:space="preserve">till </w:t>
+        <w:t>31</w:t>
       </w:r>
       <w:r>
         <w:rPr>
@@ -78,12 +77,21 @@
           <w:bCs/>
           <w:sz w:val="32"/>
           <w:szCs w:val="32"/>
-          <w:highlight w:val="red"/>
+          <w:u w:val="single"/>
+          <w:vertAlign w:val="superscript"/>
+        </w:rPr>
+        <w:t>st</w:t>
+      </w:r>
+      <w:r>
+        <w:rPr>
+          <w:b/>
+          <w:bCs/>
+          <w:sz w:val="32"/>
+          <w:szCs w:val="32"/>
           <w:u w:val="single"/>
         </w:rPr>
-        <w:t>????</w:t>
+        <w:t xml:space="preserve"> July 2025</w:t>
       </w:r>
-      <w:proofErr w:type="gramEnd"/>
       <w:r>
         <w:rPr>
           <w:bCs/>
@@ -97,16 +105,14 @@
       <w:pPr>
         <w:jc w:val="center"/>
         <w:rPr>
-          <w:bCs/>
-          <w:sz w:val="32"/>
-          <w:szCs w:val="32"/>
+          <w:b/>
+          <w:szCs w:val="24"/>
         </w:rPr>
       </w:pPr>
       <w:r>
         <w:rPr>
-          <w:bCs/>
-          <w:sz w:val="32"/>
-          <w:szCs w:val="32"/>
+          <w:b/>
+          <w:szCs w:val="24"/>
         </w:rPr>
         <w:t>(ignore those which are already incorporated in your book’s version and date)</w:t>
       </w:r>
@@ -126,26 +132,30 @@
         <w:tblLook w:val="04A0" w:firstRow="1" w:lastRow="0" w:firstColumn="1" w:lastColumn="0" w:noHBand="0" w:noVBand="1"/>
       </w:tblPr>
       <w:tblGrid>
-        <w:gridCol w:w="3006"/>
-        <w:gridCol w:w="5244"/>
+        <w:gridCol w:w="3147"/>
+        <w:gridCol w:w="5103"/>
         <w:gridCol w:w="5103"/>
       </w:tblGrid>
       <w:tr>
         <w:tc>
           <w:tcPr>
-            <w:tcW w:w="3006" w:type="dxa"/>
+            <w:tcW w:w="3147" w:type="dxa"/>
           </w:tcPr>
           <w:p>
             <w:pPr>
               <w:spacing w:before="0" w:line="240" w:lineRule="auto"/>
               <w:jc w:val="center"/>
               <w:rPr>
+                <w:b/>
+                <w:bCs/>
                 <w:sz w:val="32"/>
                 <w:szCs w:val="32"/>
               </w:rPr>
             </w:pPr>
             <w:r>
               <w:rPr>
+                <w:b/>
+                <w:bCs/>
                 <w:sz w:val="32"/>
                 <w:szCs w:val="32"/>
               </w:rPr>
@@ -157,12 +167,16 @@
               <w:spacing w:before="0" w:line="240" w:lineRule="auto"/>
               <w:jc w:val="center"/>
               <w:rPr>
+                <w:b/>
+                <w:bCs/>
                 <w:sz w:val="32"/>
                 <w:szCs w:val="32"/>
               </w:rPr>
             </w:pPr>
             <w:r>
               <w:rPr>
+                <w:b/>
+                <w:bCs/>
                 <w:sz w:val="32"/>
                 <w:szCs w:val="32"/>
               </w:rPr>
@@ -172,19 +186,23 @@
         </w:tc>
         <w:tc>
           <w:tcPr>
-            <w:tcW w:w="5244" w:type="dxa"/>
+            <w:tcW w:w="5103" w:type="dxa"/>
           </w:tcPr>
           <w:p>
             <w:pPr>
               <w:spacing w:before="0" w:line="240" w:lineRule="auto"/>
               <w:jc w:val="center"/>
               <w:rPr>
+                <w:b/>
+                <w:bCs/>
                 <w:sz w:val="32"/>
                 <w:szCs w:val="32"/>
               </w:rPr>
             </w:pPr>
             <w:r>
               <w:rPr>
+                <w:b/>
+                <w:bCs/>
                 <w:sz w:val="32"/>
                 <w:szCs w:val="32"/>
               </w:rPr>
@@ -202,12 +220,16 @@
               <w:ind w:left="-183" w:right="-18"/>
               <w:jc w:val="center"/>
               <w:rPr>
+                <w:b/>
+                <w:bCs/>
                 <w:sz w:val="32"/>
                 <w:szCs w:val="32"/>
               </w:rPr>
             </w:pPr>
             <w:r>
               <w:rPr>
+                <w:b/>
+                <w:bCs/>
                 <w:sz w:val="32"/>
                 <w:szCs w:val="32"/>
               </w:rPr>
@@ -222,7 +244,7 @@
         </w:trPr>
         <w:tc>
           <w:tcPr>
-            <w:tcW w:w="3006" w:type="dxa"/>
+            <w:tcW w:w="3147" w:type="dxa"/>
             <w:tcBorders>
               <w:top w:val="single" w:sz="4" w:space="0" w:color="000000"/>
               <w:left w:val="single" w:sz="4" w:space="0" w:color="000000"/>
@@ -352,7 +374,7 @@
         </w:tc>
         <w:tc>
           <w:tcPr>
-            <w:tcW w:w="5244" w:type="dxa"/>
+            <w:tcW w:w="5103" w:type="dxa"/>
             <w:tcBorders>
               <w:top w:val="single" w:sz="4" w:space="0" w:color="000000"/>
               <w:left w:val="single" w:sz="4" w:space="0" w:color="000000"/>
@@ -368,7 +390,6 @@
               <w:adjustRightInd w:val="0"/>
               <w:spacing w:before="0" w:line="240" w:lineRule="auto"/>
               <w:ind w:right="-136"/>
-              <w:jc w:val="center"/>
               <w:rPr>
                 <w:rFonts w:ascii="Latha" w:hAnsi="Latha" w:cs="Latha"/>
                 <w:b/>
@@ -426,7 +447,6 @@
               <w:adjustRightInd w:val="0"/>
               <w:spacing w:before="0" w:line="240" w:lineRule="auto"/>
               <w:ind w:right="-136"/>
-              <w:jc w:val="center"/>
               <w:rPr>
                 <w:rFonts w:ascii="BRH Malayalam Extra" w:hAnsi="BRH Malayalam Extra" w:cs="BRH Malayalam Extra"/>
                 <w:color w:val="000000"/>
@@ -1220,6 +1240,7 @@
           <w:szCs w:val="32"/>
           <w:u w:val="single"/>
         </w:rPr>
+        <w:lastRenderedPageBreak/>
         <w:t xml:space="preserve">TS Pada Paatam – TS 1.1 </w:t>
       </w:r>
       <w:r>
@@ -3318,7 +3339,6 @@
           <w:szCs w:val="32"/>
           <w:u w:val="single"/>
         </w:rPr>
-        <w:lastRenderedPageBreak/>
         <w:t xml:space="preserve">TS Pada Paatam – TS 1.1 </w:t>
       </w:r>
       <w:r>
@@ -3386,6 +3406,7 @@
           <w:b/>
           <w:szCs w:val="24"/>
         </w:rPr>
+        <w:lastRenderedPageBreak/>
         <w:t>(ignore those which are already incorporated in your book’s version and date)</w:t>
       </w:r>
     </w:p>
@@ -4071,7 +4092,6 @@
           <w:szCs w:val="32"/>
           <w:u w:val="single"/>
         </w:rPr>
-        <w:lastRenderedPageBreak/>
         <w:t xml:space="preserve">TS Pada Paatam – TS 1.1 </w:t>
       </w:r>
       <w:r>
@@ -4141,6 +4161,7 @@
           <w:sz w:val="28"/>
           <w:szCs w:val="28"/>
         </w:rPr>
+        <w:lastRenderedPageBreak/>
         <w:t>(ignore those which are already incorporated in your book’s version and date)</w:t>
       </w:r>
     </w:p>
@@ -16867,6 +16888,7 @@
                 <w:cs/>
                 <w:lang w:bidi="ta-IN"/>
               </w:rPr>
+              <w:lastRenderedPageBreak/>
               <w:t>ஊ</w:t>
             </w:r>
             <w:r>
@@ -17061,7 +17083,6 @@
                 <w:szCs w:val="28"/>
                 <w:lang w:bidi="ta-IN"/>
               </w:rPr>
-              <w:lastRenderedPageBreak/>
               <w:t xml:space="preserve">1.1.13.3 Padam </w:t>
             </w:r>
             <w:r>

</xml_diff>